<commit_message>
Remove Notion links from tailored resume
The project titles linked to private workspace pages that 404 for anyone
outside the workspace. Titles now render as plain text, unchanged visually.

Co-Authored-By: Claude Opus 5 <noreply@anthropic.com>
Claude-Session: https://claude.ai/code/session_016j5nAUmtmieWeSYgPNt7oe
</commit_message>
<xml_diff>
--- a/resume/out/Erik_Leavell_Resume_Abacum_AI.docx
+++ b/resume/out/Erik_Leavell_Resume_Abacum_AI.docx
@@ -692,17 +692,17 @@
               <w:widowControl w:val="0"/>
               <w:spacing w:before="0" w:after="32" w:line="240" w:lineRule="auto"/>
             </w:pPr>
-            <w:hyperlink r:id="rId9">
-              <w:r>
-                <w:rPr>
-                  <w:rFonts w:ascii="Liberation Sans" w:hAnsi="Liberation Sans"/>
-                  <w:b/>
-                  <w:color w:val="1B2735"/>
-                  <w:sz w:val="20"/>
-                </w:rPr>
-                <w:t xml:space="preserve">Invoice Butler</w:t>
-              </w:r>
-            </w:hyperlink>
+            <w:r>
+              <w:rPr>
+                <w:rFonts w:ascii="Liberation Sans" w:hAnsi="Liberation Sans"/>
+                <w:b/>
+                <w:i w:val="0"/>
+                <w:color w:val="1B2735"/>
+                <w:sz w:val="20"/>
+                <w:rFonts w:ascii="Liberation Sans" w:hAnsi="Liberation Sans" w:cs="Liberation Sans"/>
+              </w:rPr>
+              <w:t>Invoice Butler</w:t>
+            </w:r>
             <w:r>
               <w:rPr>
                 <w:rFonts w:ascii="Liberation Sans" w:hAnsi="Liberation Sans"/>
@@ -738,17 +738,17 @@
               <w:widowControl w:val="0"/>
               <w:spacing w:before="0" w:after="32" w:line="240" w:lineRule="auto"/>
             </w:pPr>
-            <w:hyperlink r:id="rId10">
-              <w:r>
-                <w:rPr>
-                  <w:rFonts w:ascii="Liberation Sans" w:hAnsi="Liberation Sans"/>
-                  <w:b/>
-                  <w:color w:val="1B2735"/>
-                  <w:sz w:val="20"/>
-                </w:rPr>
-                <w:t xml:space="preserve">Compliance Agent Ecosystem</w:t>
-              </w:r>
-            </w:hyperlink>
+            <w:r>
+              <w:rPr>
+                <w:rFonts w:ascii="Liberation Sans" w:hAnsi="Liberation Sans"/>
+                <w:b/>
+                <w:i w:val="0"/>
+                <w:color w:val="1B2735"/>
+                <w:sz w:val="20"/>
+                <w:rFonts w:ascii="Liberation Sans" w:hAnsi="Liberation Sans" w:cs="Liberation Sans"/>
+              </w:rPr>
+              <w:t>Compliance Agent Ecosystem</w:t>
+            </w:r>
             <w:r>
               <w:rPr>
                 <w:rFonts w:ascii="Liberation Sans" w:hAnsi="Liberation Sans"/>

</xml_diff>

<commit_message>
Attach outcome metrics to both AI systems
Invoice Butler now carries the AR aging result (126 days to 43) and the
Compliance Agent Ecosystem carries a 95% completion rate on questionnaires
running to 1,000 questions. Applied to both resumes: the april AI-agents
bullet in the finance version, and the AI Systems descriptions in the
Abacum version, where the new completion rate replaces the 152-item
questionnaire detail.

Co-Authored-By: Claude Opus 5 <noreply@anthropic.com>
Claude-Session: https://claude.ai/code/session_016j5nAUmtmieWeSYgPNt7oe
</commit_message>
<xml_diff>
--- a/resume/out/Erik_Leavell_Resume_Abacum_AI.docx
+++ b/resume/out/Erik_Leavell_Resume_Abacum_AI.docx
@@ -730,7 +730,7 @@
                 <w:sz w:val="18"/>
                 <w:rFonts w:ascii="Liberation Sans" w:hAnsi="Liberation Sans" w:cs="Liberation Sans"/>
               </w:rPr>
-              <w:t>Designed and deployed a ten-stage collections system that moves overdue accounts without manual chasing: tiered automated email dunning in two customer voices, a Slack-bot gate that posts account dossiers and hands ownership to Customer Success, an automatic Growth escalation ladder applying staged commercial pressure, and a hard auto-escalation backstop. I built the tag-driven workflow architecture, the escalation and guardrail logic, the Slack integration, and every email template.</w:t>
+              <w:t>Designed and deployed a ten-stage collections system that moves overdue accounts without manual chasing, cutting AR aging from 126 days to 43: tiered automated email dunning in two customer voices, a Slack-bot gate that posts account dossiers and hands ownership to Customer Success, an automatic Growth escalation ladder applying staged commercial pressure, and a hard auto-escalation backstop. I built the tag-driven workflow architecture, the escalation and guardrail logic, the Slack integration, and every email template.</w:t>
             </w:r>
           </w:p>
           <w:p>
@@ -776,7 +776,7 @@
                 <w:sz w:val="18"/>
                 <w:rFonts w:ascii="Liberation Sans" w:hAnsi="Liberation Sans" w:cs="Liberation Sans"/>
               </w:rPr>
-              <w:t>Architected and operate a multi-agent system automating enterprise security and vendor-risk questionnaire responses: an autofill agent drafting against a governed 320-row answer bank, an evidence-conversion agent turning SOC and penetration-test PDFs into queryable knowledge pages, a knowledge-base health monitor, and an append-only control agent that refuses to close a run with unresolved approval gates. Runs on scheduled crons behind human review gates; a 152-item enterprise questionnaire now comes back as a reviewed draft.</w:t>
+              <w:t>Architected and operate a multi-agent system automating enterprise security and vendor-risk questionnaire responses: an autofill agent drafting against a governed 320-row answer bank, an evidence-conversion agent turning SOC and penetration-test PDFs into queryable knowledge pages, a knowledge-base health monitor, and an append-only control agent that refuses to close a run with unresolved approval gates. Runs on scheduled crons behind human review gates, hitting a 95% completion rate on questionnaires running to 1,000 questions.</w:t>
             </w:r>
           </w:p>
           <w:p>

</xml_diff>